<commit_message>
Optimize line spacing and heading formatting to target 14 pages naturally
</commit_message>
<xml_diff>
--- a/AI_Assignment_02_Solution_v3.docx
+++ b/AI_Assignment_02_Solution_v3.docx
@@ -277,7 +277,7 @@
     </w:p>
     <w:p>
       <w:pPr>
-        <w:spacing w:after="120" w:before="240"/>
+        <w:spacing w:after="80" w:before="180"/>
         <w:jc w:val="left"/>
       </w:pPr>
       <w:r>
@@ -293,7 +293,7 @@
     </w:p>
     <w:p>
       <w:pPr>
-        <w:spacing w:after="180" w:line="360"/>
+        <w:spacing w:after="120" w:line="312"/>
         <w:jc w:val="left"/>
       </w:pPr>
       <w:r>
@@ -307,7 +307,7 @@
     </w:p>
     <w:p>
       <w:pPr>
-        <w:spacing w:after="120" w:before="240"/>
+        <w:spacing w:after="80" w:before="180"/>
         <w:jc w:val="left"/>
       </w:pPr>
       <w:r>
@@ -323,7 +323,7 @@
     </w:p>
     <w:p>
       <w:pPr>
-        <w:spacing w:after="180" w:line="360"/>
+        <w:spacing w:after="120" w:line="312"/>
         <w:jc w:val="left"/>
       </w:pPr>
       <w:r>
@@ -337,7 +337,7 @@
     </w:p>
     <w:p>
       <w:pPr>
-        <w:spacing w:after="180" w:line="360"/>
+        <w:spacing w:after="120" w:line="312"/>
         <w:jc w:val="left"/>
       </w:pPr>
       <w:r>
@@ -361,7 +361,7 @@
     </w:p>
     <w:p>
       <w:pPr>
-        <w:spacing w:after="180" w:line="360"/>
+        <w:spacing w:after="120" w:line="312"/>
         <w:jc w:val="left"/>
       </w:pPr>
       <w:r>
@@ -385,7 +385,7 @@
     </w:p>
     <w:p>
       <w:pPr>
-        <w:spacing w:after="180" w:line="360"/>
+        <w:spacing w:after="120" w:line="312"/>
         <w:jc w:val="left"/>
       </w:pPr>
       <w:r>
@@ -404,7 +404,7 @@
           <w:ilvl w:val="0"/>
           <w:numId w:val="1"/>
         </w:numPr>
-        <w:spacing w:after="120" w:line="360"/>
+        <w:spacing w:after="80" w:line="312"/>
       </w:pPr>
       <w:r>
         <w:rPr>
@@ -422,7 +422,7 @@
           <w:ilvl w:val="0"/>
           <w:numId w:val="1"/>
         </w:numPr>
-        <w:spacing w:after="120" w:line="360"/>
+        <w:spacing w:after="80" w:line="312"/>
       </w:pPr>
       <w:r>
         <w:rPr>
@@ -440,7 +440,7 @@
           <w:ilvl w:val="0"/>
           <w:numId w:val="1"/>
         </w:numPr>
-        <w:spacing w:after="120" w:line="360"/>
+        <w:spacing w:after="80" w:line="312"/>
       </w:pPr>
       <w:r>
         <w:rPr>
@@ -458,7 +458,7 @@
           <w:ilvl w:val="0"/>
           <w:numId w:val="1"/>
         </w:numPr>
-        <w:spacing w:after="120" w:line="360"/>
+        <w:spacing w:after="80" w:line="312"/>
       </w:pPr>
       <w:r>
         <w:rPr>
@@ -476,7 +476,7 @@
           <w:ilvl w:val="0"/>
           <w:numId w:val="1"/>
         </w:numPr>
-        <w:spacing w:after="120" w:line="360"/>
+        <w:spacing w:after="80" w:line="312"/>
       </w:pPr>
       <w:r>
         <w:rPr>
@@ -489,7 +489,7 @@
     </w:p>
     <w:p>
       <w:pPr>
-        <w:spacing w:after="120" w:before="240"/>
+        <w:spacing w:after="80" w:before="180"/>
         <w:jc w:val="left"/>
       </w:pPr>
       <w:r>
@@ -505,7 +505,7 @@
     </w:p>
     <w:p>
       <w:pPr>
-        <w:spacing w:after="180" w:line="360"/>
+        <w:spacing w:after="120" w:line="312"/>
         <w:jc w:val="left"/>
       </w:pPr>
       <w:r>
@@ -519,7 +519,7 @@
     </w:p>
     <w:p>
       <w:pPr>
-        <w:spacing w:after="180" w:line="360"/>
+        <w:spacing w:after="120" w:line="312"/>
         <w:jc w:val="left"/>
       </w:pPr>
       <w:r>
@@ -533,7 +533,7 @@
     </w:p>
     <w:p>
       <w:pPr>
-        <w:spacing w:after="180" w:line="360"/>
+        <w:spacing w:after="120" w:line="312"/>
         <w:jc w:val="left"/>
       </w:pPr>
       <w:r>
@@ -547,7 +547,7 @@
     </w:p>
     <w:p>
       <w:pPr>
-        <w:spacing w:after="180" w:line="360"/>
+        <w:spacing w:after="120" w:line="312"/>
         <w:jc w:val="left"/>
       </w:pPr>
       <w:r>
@@ -561,7 +561,7 @@
     </w:p>
     <w:p>
       <w:pPr>
-        <w:spacing w:after="120" w:before="240"/>
+        <w:spacing w:after="80" w:before="180"/>
         <w:jc w:val="left"/>
       </w:pPr>
       <w:r>
@@ -577,7 +577,7 @@
     </w:p>
     <w:p>
       <w:pPr>
-        <w:spacing w:after="180" w:line="360"/>
+        <w:spacing w:after="120" w:line="312"/>
         <w:jc w:val="left"/>
       </w:pPr>
       <w:r>
@@ -591,7 +591,7 @@
     </w:p>
     <w:p>
       <w:pPr>
-        <w:spacing w:after="80" w:before="160"/>
+        <w:spacing w:after="50" w:before="120"/>
         <w:jc w:val="left"/>
       </w:pPr>
       <w:r>
@@ -609,7 +609,7 @@
     </w:p>
     <w:p>
       <w:pPr>
-        <w:spacing w:after="180" w:line="360"/>
+        <w:spacing w:after="120" w:line="312"/>
         <w:jc w:val="left"/>
       </w:pPr>
       <w:r>
@@ -623,7 +623,7 @@
     </w:p>
     <w:p>
       <w:pPr>
-        <w:spacing w:after="180" w:line="360"/>
+        <w:spacing w:after="120" w:line="312"/>
         <w:jc w:val="left"/>
       </w:pPr>
       <w:r>
@@ -637,7 +637,7 @@
     </w:p>
     <w:p>
       <w:pPr>
-        <w:spacing w:after="80" w:before="160"/>
+        <w:spacing w:after="50" w:before="120"/>
         <w:jc w:val="left"/>
       </w:pPr>
       <w:r>
@@ -655,7 +655,7 @@
     </w:p>
     <w:p>
       <w:pPr>
-        <w:spacing w:after="180" w:line="360"/>
+        <w:spacing w:after="120" w:line="312"/>
         <w:jc w:val="left"/>
       </w:pPr>
       <w:r>
@@ -669,7 +669,7 @@
     </w:p>
     <w:p>
       <w:pPr>
-        <w:spacing w:after="180" w:line="360"/>
+        <w:spacing w:after="120" w:line="312"/>
         <w:jc w:val="left"/>
       </w:pPr>
       <w:r>
@@ -683,7 +683,7 @@
     </w:p>
     <w:p>
       <w:pPr>
-        <w:spacing w:after="80" w:before="160"/>
+        <w:spacing w:after="50" w:before="120"/>
         <w:jc w:val="left"/>
       </w:pPr>
       <w:r>
@@ -701,7 +701,7 @@
     </w:p>
     <w:p>
       <w:pPr>
-        <w:spacing w:after="180" w:line="360"/>
+        <w:spacing w:after="120" w:line="312"/>
         <w:jc w:val="left"/>
       </w:pPr>
       <w:r>
@@ -715,7 +715,7 @@
     </w:p>
     <w:p>
       <w:pPr>
-        <w:spacing w:after="180" w:line="360"/>
+        <w:spacing w:after="120" w:line="312"/>
         <w:jc w:val="left"/>
       </w:pPr>
       <w:r>
@@ -729,7 +729,7 @@
     </w:p>
     <w:p>
       <w:pPr>
-        <w:spacing w:after="180" w:line="360"/>
+        <w:spacing w:after="120" w:line="312"/>
         <w:jc w:val="left"/>
       </w:pPr>
       <w:r>
@@ -743,7 +743,7 @@
     </w:p>
     <w:p>
       <w:pPr>
-        <w:spacing w:after="80" w:before="160"/>
+        <w:spacing w:after="50" w:before="120"/>
         <w:jc w:val="left"/>
       </w:pPr>
       <w:r>
@@ -761,7 +761,7 @@
     </w:p>
     <w:p>
       <w:pPr>
-        <w:spacing w:after="180" w:line="360"/>
+        <w:spacing w:after="120" w:line="312"/>
         <w:jc w:val="left"/>
       </w:pPr>
       <w:r>
@@ -775,7 +775,7 @@
     </w:p>
     <w:p>
       <w:pPr>
-        <w:spacing w:after="80" w:before="160"/>
+        <w:spacing w:after="50" w:before="120"/>
         <w:jc w:val="left"/>
       </w:pPr>
       <w:r>
@@ -793,7 +793,7 @@
     </w:p>
     <w:p>
       <w:pPr>
-        <w:spacing w:after="180" w:line="360"/>
+        <w:spacing w:after="120" w:line="312"/>
         <w:jc w:val="left"/>
       </w:pPr>
       <w:r>
@@ -807,7 +807,7 @@
     </w:p>
     <w:p>
       <w:pPr>
-        <w:spacing w:after="120" w:before="240"/>
+        <w:spacing w:after="80" w:before="180"/>
         <w:jc w:val="left"/>
       </w:pPr>
       <w:r>
@@ -823,7 +823,7 @@
     </w:p>
     <w:p>
       <w:pPr>
-        <w:spacing w:after="180" w:line="360"/>
+        <w:spacing w:after="120" w:line="312"/>
         <w:jc w:val="left"/>
       </w:pPr>
       <w:r>
@@ -837,7 +837,7 @@
     </w:p>
     <w:p>
       <w:pPr>
-        <w:spacing w:after="80" w:before="160"/>
+        <w:spacing w:after="50" w:before="120"/>
         <w:jc w:val="left"/>
       </w:pPr>
       <w:r>
@@ -855,7 +855,7 @@
     </w:p>
     <w:p>
       <w:pPr>
-        <w:spacing w:after="180" w:line="360"/>
+        <w:spacing w:after="120" w:line="312"/>
         <w:jc w:val="left"/>
       </w:pPr>
       <w:r>
@@ -931,7 +931,7 @@
     </w:p>
     <w:p>
       <w:pPr>
-        <w:spacing w:after="80" w:before="160"/>
+        <w:spacing w:after="50" w:before="120"/>
         <w:jc w:val="left"/>
       </w:pPr>
       <w:r>
@@ -949,7 +949,7 @@
     </w:p>
     <w:p>
       <w:pPr>
-        <w:spacing w:after="180" w:line="360"/>
+        <w:spacing w:after="120" w:line="312"/>
         <w:jc w:val="left"/>
       </w:pPr>
       <w:r>
@@ -963,7 +963,7 @@
     </w:p>
     <w:p>
       <w:pPr>
-        <w:spacing w:after="180" w:line="360"/>
+        <w:spacing w:after="120" w:line="312"/>
         <w:jc w:val="left"/>
       </w:pPr>
       <w:r>
@@ -987,7 +987,7 @@
     </w:p>
     <w:p>
       <w:pPr>
-        <w:spacing w:after="180" w:line="360"/>
+        <w:spacing w:after="120" w:line="312"/>
         <w:jc w:val="left"/>
       </w:pPr>
       <w:r>
@@ -1011,7 +1011,7 @@
     </w:p>
     <w:p>
       <w:pPr>
-        <w:spacing w:after="180" w:line="360"/>
+        <w:spacing w:after="120" w:line="312"/>
         <w:jc w:val="left"/>
       </w:pPr>
       <w:r>
@@ -1035,7 +1035,7 @@
     </w:p>
     <w:p>
       <w:pPr>
-        <w:spacing w:after="180" w:line="360"/>
+        <w:spacing w:after="120" w:line="312"/>
         <w:jc w:val="left"/>
       </w:pPr>
       <w:r>
@@ -1059,7 +1059,7 @@
     </w:p>
     <w:p>
       <w:pPr>
-        <w:spacing w:after="180" w:line="360"/>
+        <w:spacing w:after="120" w:line="312"/>
         <w:jc w:val="left"/>
       </w:pPr>
       <w:r>
@@ -1083,7 +1083,7 @@
     </w:p>
     <w:p>
       <w:pPr>
-        <w:spacing w:after="180" w:line="360"/>
+        <w:spacing w:after="120" w:line="312"/>
         <w:jc w:val="left"/>
       </w:pPr>
       <w:r>
@@ -1107,7 +1107,7 @@
     </w:p>
     <w:p>
       <w:pPr>
-        <w:spacing w:after="180" w:line="360"/>
+        <w:spacing w:after="120" w:line="312"/>
         <w:jc w:val="left"/>
       </w:pPr>
       <w:r>
@@ -1183,7 +1183,7 @@
     </w:p>
     <w:p>
       <w:pPr>
-        <w:spacing w:after="80" w:before="160"/>
+        <w:spacing w:after="50" w:before="120"/>
         <w:jc w:val="left"/>
       </w:pPr>
       <w:r>
@@ -1201,7 +1201,7 @@
     </w:p>
     <w:p>
       <w:pPr>
-        <w:spacing w:after="180" w:line="360"/>
+        <w:spacing w:after="120" w:line="312"/>
         <w:jc w:val="left"/>
       </w:pPr>
       <w:r>
@@ -1215,7 +1215,7 @@
     </w:p>
     <w:p>
       <w:pPr>
-        <w:spacing w:after="180" w:line="360"/>
+        <w:spacing w:after="120" w:line="312"/>
         <w:jc w:val="left"/>
       </w:pPr>
       <w:r>
@@ -1239,7 +1239,7 @@
     </w:p>
     <w:p>
       <w:pPr>
-        <w:spacing w:after="180" w:line="360"/>
+        <w:spacing w:after="120" w:line="312"/>
         <w:jc w:val="left"/>
       </w:pPr>
       <w:r>
@@ -1263,7 +1263,7 @@
     </w:p>
     <w:p>
       <w:pPr>
-        <w:spacing w:after="180" w:line="360"/>
+        <w:spacing w:after="120" w:line="312"/>
         <w:jc w:val="left"/>
       </w:pPr>
       <w:r>
@@ -1287,7 +1287,7 @@
     </w:p>
     <w:p>
       <w:pPr>
-        <w:spacing w:after="180" w:line="360"/>
+        <w:spacing w:after="120" w:line="312"/>
         <w:jc w:val="left"/>
       </w:pPr>
       <w:r>
@@ -1311,7 +1311,7 @@
     </w:p>
     <w:p>
       <w:pPr>
-        <w:spacing w:after="180" w:line="360"/>
+        <w:spacing w:after="120" w:line="312"/>
         <w:jc w:val="left"/>
       </w:pPr>
       <w:r>
@@ -1335,7 +1335,7 @@
     </w:p>
     <w:p>
       <w:pPr>
-        <w:spacing w:after="80" w:before="160"/>
+        <w:spacing w:after="50" w:before="120"/>
         <w:jc w:val="left"/>
       </w:pPr>
       <w:r>
@@ -1353,7 +1353,7 @@
     </w:p>
     <w:p>
       <w:pPr>
-        <w:spacing w:after="180" w:line="360"/>
+        <w:spacing w:after="120" w:line="312"/>
         <w:jc w:val="left"/>
       </w:pPr>
       <w:r>
@@ -1367,7 +1367,7 @@
     </w:p>
     <w:p>
       <w:pPr>
-        <w:spacing w:after="80" w:before="160"/>
+        <w:spacing w:after="50" w:before="120"/>
         <w:jc w:val="left"/>
       </w:pPr>
       <w:r>
@@ -1385,7 +1385,7 @@
     </w:p>
     <w:p>
       <w:pPr>
-        <w:spacing w:after="180" w:line="360"/>
+        <w:spacing w:after="120" w:line="312"/>
         <w:jc w:val="left"/>
       </w:pPr>
       <w:r>
@@ -1399,7 +1399,7 @@
     </w:p>
     <w:p>
       <w:pPr>
-        <w:spacing w:after="180" w:line="360"/>
+        <w:spacing w:after="120" w:line="312"/>
         <w:jc w:val="left"/>
       </w:pPr>
       <w:r>
@@ -1413,7 +1413,7 @@
     </w:p>
     <w:p>
       <w:pPr>
-        <w:spacing w:after="60" w:before="120"/>
+        <w:spacing w:after="40" w:before="90"/>
         <w:jc w:val="left"/>
       </w:pPr>
       <w:r>
@@ -1429,7 +1429,7 @@
     </w:p>
     <w:p>
       <w:pPr>
-        <w:spacing w:after="80" w:line="200"/>
+        <w:spacing w:after="40" w:line="180"/>
         <w:ind w:left="360"/>
       </w:pPr>
       <w:r>
@@ -1443,7 +1443,7 @@
     </w:p>
     <w:p>
       <w:pPr>
-        <w:spacing w:after="80" w:line="200"/>
+        <w:spacing w:after="40" w:line="180"/>
         <w:ind w:left="360"/>
       </w:pPr>
       <w:r>
@@ -1457,7 +1457,7 @@
     </w:p>
     <w:p>
       <w:pPr>
-        <w:spacing w:after="80" w:line="200"/>
+        <w:spacing w:after="40" w:line="180"/>
         <w:ind w:left="360"/>
       </w:pPr>
       <w:r>
@@ -1471,7 +1471,7 @@
     </w:p>
     <w:p>
       <w:pPr>
-        <w:spacing w:after="80" w:line="200"/>
+        <w:spacing w:after="40" w:line="180"/>
         <w:ind w:left="360"/>
       </w:pPr>
       <w:r>
@@ -1485,7 +1485,7 @@
     </w:p>
     <w:p>
       <w:pPr>
-        <w:spacing w:after="80" w:line="200"/>
+        <w:spacing w:after="40" w:line="180"/>
         <w:ind w:left="360"/>
       </w:pPr>
       <w:r>
@@ -1499,7 +1499,7 @@
     </w:p>
     <w:p>
       <w:pPr>
-        <w:spacing w:after="80" w:line="200"/>
+        <w:spacing w:after="40" w:line="180"/>
         <w:ind w:left="360"/>
       </w:pPr>
       <w:r>
@@ -1513,7 +1513,7 @@
     </w:p>
     <w:p>
       <w:pPr>
-        <w:spacing w:after="80" w:line="200"/>
+        <w:spacing w:after="40" w:line="180"/>
         <w:ind w:left="360"/>
       </w:pPr>
       <w:r>
@@ -1527,7 +1527,7 @@
     </w:p>
     <w:p>
       <w:pPr>
-        <w:spacing w:after="60" w:before="120"/>
+        <w:spacing w:after="40" w:before="90"/>
         <w:jc w:val="left"/>
       </w:pPr>
       <w:r>
@@ -1543,7 +1543,7 @@
     </w:p>
     <w:p>
       <w:pPr>
-        <w:spacing w:after="80" w:line="200"/>
+        <w:spacing w:after="40" w:line="180"/>
         <w:ind w:left="360"/>
       </w:pPr>
       <w:r>
@@ -1557,7 +1557,7 @@
     </w:p>
     <w:p>
       <w:pPr>
-        <w:spacing w:after="80" w:line="200"/>
+        <w:spacing w:after="40" w:line="180"/>
         <w:ind w:left="360"/>
       </w:pPr>
       <w:r>
@@ -1571,7 +1571,7 @@
     </w:p>
     <w:p>
       <w:pPr>
-        <w:spacing w:after="80" w:line="200"/>
+        <w:spacing w:after="40" w:line="180"/>
         <w:ind w:left="360"/>
       </w:pPr>
       <w:r>
@@ -1585,7 +1585,7 @@
     </w:p>
     <w:p>
       <w:pPr>
-        <w:spacing w:after="80" w:line="200"/>
+        <w:spacing w:after="40" w:line="180"/>
         <w:ind w:left="360"/>
       </w:pPr>
       <w:r>
@@ -1599,7 +1599,7 @@
     </w:p>
     <w:p>
       <w:pPr>
-        <w:spacing w:after="80" w:line="200"/>
+        <w:spacing w:after="40" w:line="180"/>
         <w:ind w:left="360"/>
       </w:pPr>
       <w:r>
@@ -1613,7 +1613,7 @@
     </w:p>
     <w:p>
       <w:pPr>
-        <w:spacing w:after="80" w:line="200"/>
+        <w:spacing w:after="40" w:line="180"/>
         <w:ind w:left="360"/>
       </w:pPr>
       <w:r>
@@ -1627,7 +1627,7 @@
     </w:p>
     <w:p>
       <w:pPr>
-        <w:spacing w:after="80" w:line="200"/>
+        <w:spacing w:after="40" w:line="180"/>
         <w:ind w:left="360"/>
       </w:pPr>
       <w:r>
@@ -1641,7 +1641,7 @@
     </w:p>
     <w:p>
       <w:pPr>
-        <w:spacing w:after="60" w:before="120"/>
+        <w:spacing w:after="40" w:before="90"/>
         <w:jc w:val="left"/>
       </w:pPr>
       <w:r>
@@ -1657,7 +1657,7 @@
     </w:p>
     <w:p>
       <w:pPr>
-        <w:spacing w:after="80" w:line="200"/>
+        <w:spacing w:after="40" w:line="180"/>
         <w:ind w:left="360"/>
       </w:pPr>
       <w:r>
@@ -1671,7 +1671,7 @@
     </w:p>
     <w:p>
       <w:pPr>
-        <w:spacing w:after="80" w:line="200"/>
+        <w:spacing w:after="40" w:line="180"/>
         <w:ind w:left="360"/>
       </w:pPr>
       <w:r>
@@ -1685,7 +1685,7 @@
     </w:p>
     <w:p>
       <w:pPr>
-        <w:spacing w:after="80" w:line="200"/>
+        <w:spacing w:after="40" w:line="180"/>
         <w:ind w:left="360"/>
       </w:pPr>
       <w:r>
@@ -1699,7 +1699,7 @@
     </w:p>
     <w:p>
       <w:pPr>
-        <w:spacing w:after="80" w:line="200"/>
+        <w:spacing w:after="40" w:line="180"/>
         <w:ind w:left="360"/>
       </w:pPr>
       <w:r>
@@ -1713,7 +1713,7 @@
     </w:p>
     <w:p>
       <w:pPr>
-        <w:spacing w:after="60" w:before="120"/>
+        <w:spacing w:after="40" w:before="90"/>
         <w:jc w:val="left"/>
       </w:pPr>
       <w:r>
@@ -1729,7 +1729,7 @@
     </w:p>
     <w:p>
       <w:pPr>
-        <w:spacing w:after="80" w:line="200"/>
+        <w:spacing w:after="40" w:line="180"/>
         <w:ind w:left="360"/>
       </w:pPr>
       <w:r>
@@ -1743,7 +1743,7 @@
     </w:p>
     <w:p>
       <w:pPr>
-        <w:spacing w:after="80" w:line="200"/>
+        <w:spacing w:after="40" w:line="180"/>
         <w:ind w:left="360"/>
       </w:pPr>
       <w:r>
@@ -1757,7 +1757,7 @@
     </w:p>
     <w:p>
       <w:pPr>
-        <w:spacing w:after="80" w:line="200"/>
+        <w:spacing w:after="40" w:line="180"/>
         <w:ind w:left="360"/>
       </w:pPr>
       <w:r>
@@ -1771,7 +1771,7 @@
     </w:p>
     <w:p>
       <w:pPr>
-        <w:spacing w:after="80" w:line="200"/>
+        <w:spacing w:after="40" w:line="180"/>
         <w:ind w:left="360"/>
       </w:pPr>
       <w:r>
@@ -1785,7 +1785,7 @@
     </w:p>
     <w:p>
       <w:pPr>
-        <w:spacing w:after="80" w:before="160"/>
+        <w:spacing w:after="50" w:before="120"/>
         <w:jc w:val="left"/>
       </w:pPr>
       <w:r>
@@ -1803,7 +1803,7 @@
     </w:p>
     <w:p>
       <w:pPr>
-        <w:spacing w:after="180" w:line="360"/>
+        <w:spacing w:after="120" w:line="312"/>
         <w:jc w:val="left"/>
       </w:pPr>
       <w:r>
@@ -1817,7 +1817,7 @@
     </w:p>
     <w:p>
       <w:pPr>
-        <w:spacing w:after="180" w:line="360"/>
+        <w:spacing w:after="120" w:line="312"/>
         <w:jc w:val="left"/>
       </w:pPr>
       <w:r>
@@ -1841,7 +1841,7 @@
     </w:p>
     <w:p>
       <w:pPr>
-        <w:spacing w:after="180" w:line="360"/>
+        <w:spacing w:after="120" w:line="312"/>
         <w:jc w:val="left"/>
       </w:pPr>
       <w:r>
@@ -1865,7 +1865,7 @@
     </w:p>
     <w:p>
       <w:pPr>
-        <w:spacing w:after="180" w:line="360"/>
+        <w:spacing w:after="120" w:line="312"/>
         <w:jc w:val="left"/>
       </w:pPr>
       <w:r>
@@ -1889,7 +1889,7 @@
     </w:p>
     <w:p>
       <w:pPr>
-        <w:spacing w:after="80" w:line="200"/>
+        <w:spacing w:after="40" w:line="180"/>
         <w:ind w:left="360"/>
       </w:pPr>
       <w:r>
@@ -1903,7 +1903,7 @@
     </w:p>
     <w:p>
       <w:pPr>
-        <w:spacing w:after="80" w:line="200"/>
+        <w:spacing w:after="40" w:line="180"/>
         <w:ind w:left="360"/>
       </w:pPr>
       <w:r>
@@ -1917,7 +1917,7 @@
     </w:p>
     <w:p>
       <w:pPr>
-        <w:spacing w:after="80" w:line="200"/>
+        <w:spacing w:after="40" w:line="180"/>
         <w:ind w:left="360"/>
       </w:pPr>
       <w:r>
@@ -1931,7 +1931,7 @@
     </w:p>
     <w:p>
       <w:pPr>
-        <w:spacing w:after="80" w:line="200"/>
+        <w:spacing w:after="40" w:line="180"/>
         <w:ind w:left="360"/>
       </w:pPr>
       <w:r>
@@ -1945,7 +1945,7 @@
     </w:p>
     <w:p>
       <w:pPr>
-        <w:spacing w:after="80" w:line="200"/>
+        <w:spacing w:after="40" w:line="180"/>
         <w:ind w:left="360"/>
       </w:pPr>
       <w:r>
@@ -1959,7 +1959,7 @@
     </w:p>
     <w:p>
       <w:pPr>
-        <w:spacing w:after="80" w:line="200"/>
+        <w:spacing w:after="40" w:line="180"/>
         <w:ind w:left="360"/>
       </w:pPr>
       <w:r>
@@ -1973,7 +1973,7 @@
     </w:p>
     <w:p>
       <w:pPr>
-        <w:spacing w:after="80" w:line="200"/>
+        <w:spacing w:after="40" w:line="180"/>
         <w:ind w:left="360"/>
       </w:pPr>
       <w:r>
@@ -1987,7 +1987,7 @@
     </w:p>
     <w:p>
       <w:pPr>
-        <w:spacing w:after="80" w:line="200"/>
+        <w:spacing w:after="40" w:line="180"/>
         <w:ind w:left="360"/>
       </w:pPr>
       <w:r>
@@ -2001,7 +2001,7 @@
     </w:p>
     <w:p>
       <w:pPr>
-        <w:spacing w:after="80" w:line="200"/>
+        <w:spacing w:after="40" w:line="180"/>
         <w:ind w:left="360"/>
       </w:pPr>
       <w:r>
@@ -2015,7 +2015,7 @@
     </w:p>
     <w:p>
       <w:pPr>
-        <w:spacing w:after="80" w:line="200"/>
+        <w:spacing w:after="40" w:line="180"/>
         <w:ind w:left="360"/>
       </w:pPr>
       <w:r>
@@ -2029,7 +2029,7 @@
     </w:p>
     <w:p>
       <w:pPr>
-        <w:spacing w:after="80" w:line="200"/>
+        <w:spacing w:after="40" w:line="180"/>
         <w:ind w:left="360"/>
       </w:pPr>
       <w:r>
@@ -2043,7 +2043,7 @@
     </w:p>
     <w:p>
       <w:pPr>
-        <w:spacing w:after="80" w:line="200"/>
+        <w:spacing w:after="40" w:line="180"/>
         <w:ind w:left="360"/>
       </w:pPr>
       <w:r>
@@ -2057,7 +2057,7 @@
     </w:p>
     <w:p>
       <w:pPr>
-        <w:spacing w:after="80" w:line="200"/>
+        <w:spacing w:after="40" w:line="180"/>
         <w:ind w:left="360"/>
       </w:pPr>
       <w:r>
@@ -2071,7 +2071,7 @@
     </w:p>
     <w:p>
       <w:pPr>
-        <w:spacing w:after="80" w:line="200"/>
+        <w:spacing w:after="40" w:line="180"/>
         <w:ind w:left="360"/>
       </w:pPr>
       <w:r>
@@ -2085,7 +2085,7 @@
     </w:p>
     <w:p>
       <w:pPr>
-        <w:spacing w:after="180" w:line="360"/>
+        <w:spacing w:after="120" w:line="312"/>
         <w:jc w:val="left"/>
       </w:pPr>
       <w:r>
@@ -2109,7 +2109,7 @@
     </w:p>
     <w:p>
       <w:pPr>
-        <w:spacing w:after="180" w:line="360"/>
+        <w:spacing w:after="120" w:line="312"/>
         <w:jc w:val="left"/>
       </w:pPr>
       <w:r>
@@ -2123,7 +2123,7 @@
     </w:p>
     <w:p>
       <w:pPr>
-        <w:spacing w:after="180" w:line="360"/>
+        <w:spacing w:after="120" w:line="312"/>
         <w:jc w:val="left"/>
       </w:pPr>
       <w:r>
@@ -2137,7 +2137,7 @@
     </w:p>
     <w:p>
       <w:pPr>
-        <w:spacing w:after="180" w:line="360"/>
+        <w:spacing w:after="120" w:line="312"/>
         <w:jc w:val="left"/>
       </w:pPr>
       <w:r>
@@ -2151,7 +2151,7 @@
     </w:p>
     <w:p>
       <w:pPr>
-        <w:spacing w:after="180" w:line="360"/>
+        <w:spacing w:after="120" w:line="312"/>
         <w:jc w:val="left"/>
       </w:pPr>
       <w:r>
@@ -2175,7 +2175,7 @@
     </w:p>
     <w:p>
       <w:pPr>
-        <w:spacing w:after="180" w:line="360"/>
+        <w:spacing w:after="120" w:line="312"/>
         <w:jc w:val="left"/>
       </w:pPr>
       <w:r>
@@ -2189,7 +2189,7 @@
     </w:p>
     <w:p>
       <w:pPr>
-        <w:spacing w:after="180" w:line="360"/>
+        <w:spacing w:after="120" w:line="312"/>
         <w:jc w:val="left"/>
       </w:pPr>
       <w:r>
@@ -2203,7 +2203,7 @@
     </w:p>
     <w:p>
       <w:pPr>
-        <w:spacing w:after="180" w:line="360"/>
+        <w:spacing w:after="120" w:line="312"/>
         <w:jc w:val="left"/>
       </w:pPr>
       <w:r>
@@ -2217,7 +2217,7 @@
     </w:p>
     <w:p>
       <w:pPr>
-        <w:spacing w:after="80" w:before="160"/>
+        <w:spacing w:after="50" w:before="120"/>
         <w:jc w:val="left"/>
       </w:pPr>
       <w:r>
@@ -2235,7 +2235,7 @@
     </w:p>
     <w:p>
       <w:pPr>
-        <w:spacing w:after="180" w:line="360"/>
+        <w:spacing w:after="120" w:line="312"/>
         <w:jc w:val="left"/>
       </w:pPr>
       <w:r>
@@ -2249,7 +2249,7 @@
     </w:p>
     <w:p>
       <w:pPr>
-        <w:spacing w:after="180" w:line="360"/>
+        <w:spacing w:after="120" w:line="312"/>
         <w:jc w:val="left"/>
       </w:pPr>
       <w:r>
@@ -2273,7 +2273,7 @@
     </w:p>
     <w:p>
       <w:pPr>
-        <w:spacing w:after="180" w:line="360"/>
+        <w:spacing w:after="120" w:line="312"/>
         <w:jc w:val="left"/>
       </w:pPr>
       <w:r>
@@ -2297,7 +2297,7 @@
     </w:p>
     <w:p>
       <w:pPr>
-        <w:spacing w:after="180" w:line="360"/>
+        <w:spacing w:after="120" w:line="312"/>
         <w:jc w:val="left"/>
       </w:pPr>
       <w:r>
@@ -2321,7 +2321,7 @@
     </w:p>
     <w:p>
       <w:pPr>
-        <w:spacing w:after="80" w:line="200"/>
+        <w:spacing w:after="40" w:line="180"/>
         <w:ind w:left="360"/>
       </w:pPr>
       <w:r>
@@ -2335,7 +2335,7 @@
     </w:p>
     <w:p>
       <w:pPr>
-        <w:spacing w:after="80" w:line="200"/>
+        <w:spacing w:after="40" w:line="180"/>
         <w:ind w:left="360"/>
       </w:pPr>
       <w:r>
@@ -2349,7 +2349,7 @@
     </w:p>
     <w:p>
       <w:pPr>
-        <w:spacing w:after="80" w:line="200"/>
+        <w:spacing w:after="40" w:line="180"/>
         <w:ind w:left="360"/>
       </w:pPr>
       <w:r>
@@ -2363,7 +2363,7 @@
     </w:p>
     <w:p>
       <w:pPr>
-        <w:spacing w:after="80" w:line="200"/>
+        <w:spacing w:after="40" w:line="180"/>
         <w:ind w:left="360"/>
       </w:pPr>
       <w:r>
@@ -2377,7 +2377,7 @@
     </w:p>
     <w:p>
       <w:pPr>
-        <w:spacing w:after="80" w:line="200"/>
+        <w:spacing w:after="40" w:line="180"/>
         <w:ind w:left="360"/>
       </w:pPr>
       <w:r>
@@ -2391,7 +2391,7 @@
     </w:p>
     <w:p>
       <w:pPr>
-        <w:spacing w:after="80" w:line="200"/>
+        <w:spacing w:after="40" w:line="180"/>
         <w:ind w:left="360"/>
       </w:pPr>
       <w:r>
@@ -2405,7 +2405,7 @@
     </w:p>
     <w:p>
       <w:pPr>
-        <w:spacing w:after="80" w:line="200"/>
+        <w:spacing w:after="40" w:line="180"/>
         <w:ind w:left="360"/>
       </w:pPr>
       <w:r>
@@ -2419,7 +2419,7 @@
     </w:p>
     <w:p>
       <w:pPr>
-        <w:spacing w:after="80" w:line="200"/>
+        <w:spacing w:after="40" w:line="180"/>
         <w:ind w:left="360"/>
       </w:pPr>
       <w:r>
@@ -2433,7 +2433,7 @@
     </w:p>
     <w:p>
       <w:pPr>
-        <w:spacing w:after="80" w:line="200"/>
+        <w:spacing w:after="40" w:line="180"/>
         <w:ind w:left="360"/>
       </w:pPr>
       <w:r>
@@ -2447,7 +2447,7 @@
     </w:p>
     <w:p>
       <w:pPr>
-        <w:spacing w:after="80" w:line="200"/>
+        <w:spacing w:after="40" w:line="180"/>
         <w:ind w:left="360"/>
       </w:pPr>
       <w:r>
@@ -2461,7 +2461,7 @@
     </w:p>
     <w:p>
       <w:pPr>
-        <w:spacing w:after="80" w:line="200"/>
+        <w:spacing w:after="40" w:line="180"/>
         <w:ind w:left="360"/>
       </w:pPr>
       <w:r>
@@ -2475,7 +2475,7 @@
     </w:p>
     <w:p>
       <w:pPr>
-        <w:spacing w:after="80" w:line="200"/>
+        <w:spacing w:after="40" w:line="180"/>
         <w:ind w:left="360"/>
       </w:pPr>
       <w:r>
@@ -2489,7 +2489,7 @@
     </w:p>
     <w:p>
       <w:pPr>
-        <w:spacing w:after="80" w:line="200"/>
+        <w:spacing w:after="40" w:line="180"/>
         <w:ind w:left="360"/>
       </w:pPr>
       <w:r>
@@ -2503,7 +2503,7 @@
     </w:p>
     <w:p>
       <w:pPr>
-        <w:spacing w:after="80" w:line="200"/>
+        <w:spacing w:after="40" w:line="180"/>
         <w:ind w:left="360"/>
       </w:pPr>
       <w:r>
@@ -2517,7 +2517,7 @@
     </w:p>
     <w:p>
       <w:pPr>
-        <w:spacing w:after="80" w:line="200"/>
+        <w:spacing w:after="40" w:line="180"/>
         <w:ind w:left="360"/>
       </w:pPr>
       <w:r>
@@ -2531,7 +2531,7 @@
     </w:p>
     <w:p>
       <w:pPr>
-        <w:spacing w:after="80" w:line="200"/>
+        <w:spacing w:after="40" w:line="180"/>
         <w:ind w:left="360"/>
       </w:pPr>
       <w:r>
@@ -2545,7 +2545,7 @@
     </w:p>
     <w:p>
       <w:pPr>
-        <w:spacing w:after="80" w:line="200"/>
+        <w:spacing w:after="40" w:line="180"/>
         <w:ind w:left="360"/>
       </w:pPr>
       <w:r>
@@ -2559,7 +2559,7 @@
     </w:p>
     <w:p>
       <w:pPr>
-        <w:spacing w:after="80" w:line="200"/>
+        <w:spacing w:after="40" w:line="180"/>
         <w:ind w:left="360"/>
       </w:pPr>
       <w:r>
@@ -2573,7 +2573,7 @@
     </w:p>
     <w:p>
       <w:pPr>
-        <w:spacing w:after="80" w:line="200"/>
+        <w:spacing w:after="40" w:line="180"/>
         <w:ind w:left="360"/>
       </w:pPr>
       <w:r>
@@ -2587,7 +2587,7 @@
     </w:p>
     <w:p>
       <w:pPr>
-        <w:spacing w:after="80" w:line="200"/>
+        <w:spacing w:after="40" w:line="180"/>
         <w:ind w:left="360"/>
       </w:pPr>
       <w:r>
@@ -2601,7 +2601,7 @@
     </w:p>
     <w:p>
       <w:pPr>
-        <w:spacing w:after="80" w:line="200"/>
+        <w:spacing w:after="40" w:line="180"/>
         <w:ind w:left="360"/>
       </w:pPr>
       <w:r>
@@ -2615,7 +2615,7 @@
     </w:p>
     <w:p>
       <w:pPr>
-        <w:spacing w:after="80" w:line="200"/>
+        <w:spacing w:after="40" w:line="180"/>
         <w:ind w:left="360"/>
       </w:pPr>
       <w:r>
@@ -2629,7 +2629,7 @@
     </w:p>
     <w:p>
       <w:pPr>
-        <w:spacing w:after="80" w:line="200"/>
+        <w:spacing w:after="40" w:line="180"/>
         <w:ind w:left="360"/>
       </w:pPr>
       <w:r>
@@ -2643,7 +2643,7 @@
     </w:p>
     <w:p>
       <w:pPr>
-        <w:spacing w:after="80" w:line="200"/>
+        <w:spacing w:after="40" w:line="180"/>
         <w:ind w:left="360"/>
       </w:pPr>
       <w:r>
@@ -2657,7 +2657,7 @@
     </w:p>
     <w:p>
       <w:pPr>
-        <w:spacing w:after="80" w:line="200"/>
+        <w:spacing w:after="40" w:line="180"/>
         <w:ind w:left="360"/>
       </w:pPr>
       <w:r>
@@ -2671,7 +2671,7 @@
     </w:p>
     <w:p>
       <w:pPr>
-        <w:spacing w:after="80" w:line="200"/>
+        <w:spacing w:after="40" w:line="180"/>
         <w:ind w:left="360"/>
       </w:pPr>
       <w:r>
@@ -2685,7 +2685,7 @@
     </w:p>
     <w:p>
       <w:pPr>
-        <w:spacing w:after="80" w:line="200"/>
+        <w:spacing w:after="40" w:line="180"/>
         <w:ind w:left="360"/>
       </w:pPr>
       <w:r>
@@ -2699,7 +2699,7 @@
     </w:p>
     <w:p>
       <w:pPr>
-        <w:spacing w:after="80" w:line="200"/>
+        <w:spacing w:after="40" w:line="180"/>
         <w:ind w:left="360"/>
       </w:pPr>
       <w:r>
@@ -2713,7 +2713,7 @@
     </w:p>
     <w:p>
       <w:pPr>
-        <w:spacing w:after="80" w:line="200"/>
+        <w:spacing w:after="40" w:line="180"/>
         <w:ind w:left="360"/>
       </w:pPr>
       <w:r>
@@ -2727,7 +2727,7 @@
     </w:p>
     <w:p>
       <w:pPr>
-        <w:spacing w:after="80" w:line="200"/>
+        <w:spacing w:after="40" w:line="180"/>
         <w:ind w:left="360"/>
       </w:pPr>
       <w:r>
@@ -2741,7 +2741,7 @@
     </w:p>
     <w:p>
       <w:pPr>
-        <w:spacing w:after="80" w:line="200"/>
+        <w:spacing w:after="40" w:line="180"/>
         <w:ind w:left="360"/>
       </w:pPr>
       <w:r>
@@ -2755,7 +2755,7 @@
     </w:p>
     <w:p>
       <w:pPr>
-        <w:spacing w:after="80" w:line="200"/>
+        <w:spacing w:after="40" w:line="180"/>
         <w:ind w:left="360"/>
       </w:pPr>
       <w:r>
@@ -2769,7 +2769,7 @@
     </w:p>
     <w:p>
       <w:pPr>
-        <w:spacing w:after="80" w:line="200"/>
+        <w:spacing w:after="40" w:line="180"/>
         <w:ind w:left="360"/>
       </w:pPr>
       <w:r>
@@ -2783,7 +2783,7 @@
     </w:p>
     <w:p>
       <w:pPr>
-        <w:spacing w:after="80" w:line="200"/>
+        <w:spacing w:after="40" w:line="180"/>
         <w:ind w:left="360"/>
       </w:pPr>
       <w:r>
@@ -2797,7 +2797,7 @@
     </w:p>
     <w:p>
       <w:pPr>
-        <w:spacing w:after="80" w:line="200"/>
+        <w:spacing w:after="40" w:line="180"/>
         <w:ind w:left="360"/>
       </w:pPr>
       <w:r>
@@ -2811,7 +2811,7 @@
     </w:p>
     <w:p>
       <w:pPr>
-        <w:spacing w:after="80" w:line="200"/>
+        <w:spacing w:after="40" w:line="180"/>
         <w:ind w:left="360"/>
       </w:pPr>
       <w:r>
@@ -2825,7 +2825,7 @@
     </w:p>
     <w:p>
       <w:pPr>
-        <w:spacing w:after="80" w:line="200"/>
+        <w:spacing w:after="40" w:line="180"/>
         <w:ind w:left="360"/>
       </w:pPr>
       <w:r>
@@ -2839,7 +2839,7 @@
     </w:p>
     <w:p>
       <w:pPr>
-        <w:spacing w:after="180" w:line="360"/>
+        <w:spacing w:after="120" w:line="312"/>
         <w:jc w:val="left"/>
       </w:pPr>
       <w:r>
@@ -2863,7 +2863,7 @@
     </w:p>
     <w:p>
       <w:pPr>
-        <w:spacing w:after="180" w:line="360"/>
+        <w:spacing w:after="120" w:line="312"/>
         <w:jc w:val="left"/>
       </w:pPr>
       <w:r>
@@ -2877,7 +2877,7 @@
     </w:p>
     <w:p>
       <w:pPr>
-        <w:spacing w:after="180" w:line="360"/>
+        <w:spacing w:after="120" w:line="312"/>
         <w:jc w:val="left"/>
       </w:pPr>
       <w:r>
@@ -2891,7 +2891,7 @@
     </w:p>
     <w:p>
       <w:pPr>
-        <w:spacing w:after="180" w:line="360"/>
+        <w:spacing w:after="120" w:line="312"/>
         <w:jc w:val="left"/>
       </w:pPr>
       <w:r>
@@ -2905,7 +2905,7 @@
     </w:p>
     <w:p>
       <w:pPr>
-        <w:spacing w:after="180" w:line="360"/>
+        <w:spacing w:after="120" w:line="312"/>
         <w:jc w:val="left"/>
       </w:pPr>
       <w:r>
@@ -2929,7 +2929,7 @@
     </w:p>
     <w:p>
       <w:pPr>
-        <w:spacing w:after="180" w:line="360"/>
+        <w:spacing w:after="120" w:line="312"/>
         <w:jc w:val="left"/>
       </w:pPr>
       <w:r>
@@ -2943,7 +2943,7 @@
     </w:p>
     <w:p>
       <w:pPr>
-        <w:spacing w:after="180" w:line="360"/>
+        <w:spacing w:after="120" w:line="312"/>
         <w:jc w:val="left"/>
       </w:pPr>
       <w:r>
@@ -2957,7 +2957,7 @@
     </w:p>
     <w:p>
       <w:pPr>
-        <w:spacing w:after="180" w:line="360"/>
+        <w:spacing w:after="120" w:line="312"/>
         <w:jc w:val="left"/>
       </w:pPr>
       <w:r>
@@ -2971,7 +2971,7 @@
     </w:p>
     <w:p>
       <w:pPr>
-        <w:spacing w:after="120" w:before="240"/>
+        <w:spacing w:after="80" w:before="180"/>
         <w:jc w:val="left"/>
       </w:pPr>
       <w:r>
@@ -2987,7 +2987,7 @@
     </w:p>
     <w:p>
       <w:pPr>
-        <w:spacing w:after="180" w:line="360"/>
+        <w:spacing w:after="120" w:line="312"/>
         <w:jc w:val="left"/>
       </w:pPr>
       <w:r>
@@ -3001,7 +3001,7 @@
     </w:p>
     <w:p>
       <w:pPr>
-        <w:spacing w:after="80" w:before="160"/>
+        <w:spacing w:after="50" w:before="120"/>
         <w:jc w:val="left"/>
       </w:pPr>
       <w:r>
@@ -3019,7 +3019,7 @@
     </w:p>
     <w:p>
       <w:pPr>
-        <w:spacing w:after="180" w:line="360"/>
+        <w:spacing w:after="120" w:line="312"/>
         <w:jc w:val="left"/>
       </w:pPr>
       <w:r>
@@ -3038,7 +3038,7 @@
           <w:ilvl w:val="0"/>
           <w:numId w:val="1"/>
         </w:numPr>
-        <w:spacing w:after="120" w:line="360"/>
+        <w:spacing w:after="80" w:line="312"/>
       </w:pPr>
       <w:r>
         <w:rPr>
@@ -3056,7 +3056,7 @@
           <w:ilvl w:val="0"/>
           <w:numId w:val="1"/>
         </w:numPr>
-        <w:spacing w:after="120" w:line="360"/>
+        <w:spacing w:after="80" w:line="312"/>
       </w:pPr>
       <w:r>
         <w:rPr>
@@ -3074,7 +3074,7 @@
           <w:ilvl w:val="0"/>
           <w:numId w:val="1"/>
         </w:numPr>
-        <w:spacing w:after="120" w:line="360"/>
+        <w:spacing w:after="80" w:line="312"/>
       </w:pPr>
       <w:r>
         <w:rPr>
@@ -3087,7 +3087,7 @@
     </w:p>
     <w:p>
       <w:pPr>
-        <w:spacing w:after="180" w:line="360"/>
+        <w:spacing w:after="120" w:line="312"/>
         <w:jc w:val="left"/>
       </w:pPr>
       <w:r>
@@ -3596,7 +3596,7 @@
     </w:p>
     <w:p>
       <w:pPr>
-        <w:spacing w:after="80" w:before="160"/>
+        <w:spacing w:after="50" w:before="120"/>
         <w:jc w:val="left"/>
       </w:pPr>
       <w:r>
@@ -3614,7 +3614,7 @@
     </w:p>
     <w:p>
       <w:pPr>
-        <w:spacing w:after="180" w:line="360"/>
+        <w:spacing w:after="120" w:line="312"/>
         <w:jc w:val="left"/>
       </w:pPr>
       <w:r>
@@ -3628,7 +3628,7 @@
     </w:p>
     <w:p>
       <w:pPr>
-        <w:spacing w:after="180" w:line="360"/>
+        <w:spacing w:after="120" w:line="312"/>
         <w:jc w:val="left"/>
       </w:pPr>
       <w:r>
@@ -3642,7 +3642,7 @@
     </w:p>
     <w:p>
       <w:pPr>
-        <w:spacing w:after="80" w:before="160"/>
+        <w:spacing w:after="50" w:before="120"/>
         <w:jc w:val="left"/>
       </w:pPr>
       <w:r>
@@ -3660,7 +3660,7 @@
     </w:p>
     <w:p>
       <w:pPr>
-        <w:spacing w:after="180" w:line="360"/>
+        <w:spacing w:after="120" w:line="312"/>
         <w:jc w:val="left"/>
       </w:pPr>
       <w:r>
@@ -3674,7 +3674,7 @@
     </w:p>
     <w:p>
       <w:pPr>
-        <w:spacing w:after="180" w:line="360"/>
+        <w:spacing w:after="120" w:line="312"/>
         <w:jc w:val="left"/>
       </w:pPr>
       <w:r>
@@ -3693,7 +3693,7 @@
           <w:ilvl w:val="0"/>
           <w:numId w:val="1"/>
         </w:numPr>
-        <w:spacing w:after="120" w:line="360"/>
+        <w:spacing w:after="80" w:line="312"/>
       </w:pPr>
       <w:r>
         <w:rPr>
@@ -3711,7 +3711,7 @@
           <w:ilvl w:val="0"/>
           <w:numId w:val="1"/>
         </w:numPr>
-        <w:spacing w:after="120" w:line="360"/>
+        <w:spacing w:after="80" w:line="312"/>
       </w:pPr>
       <w:r>
         <w:rPr>
@@ -3729,7 +3729,7 @@
           <w:ilvl w:val="0"/>
           <w:numId w:val="1"/>
         </w:numPr>
-        <w:spacing w:after="120" w:line="360"/>
+        <w:spacing w:after="80" w:line="312"/>
       </w:pPr>
       <w:r>
         <w:rPr>
@@ -3742,7 +3742,7 @@
     </w:p>
     <w:p>
       <w:pPr>
-        <w:spacing w:after="180" w:line="360"/>
+        <w:spacing w:after="120" w:line="312"/>
         <w:jc w:val="left"/>
       </w:pPr>
       <w:r>
@@ -3756,7 +3756,7 @@
     </w:p>
     <w:p>
       <w:pPr>
-        <w:spacing w:after="120" w:before="240"/>
+        <w:spacing w:after="80" w:before="180"/>
         <w:jc w:val="left"/>
       </w:pPr>
       <w:r>
@@ -3772,7 +3772,7 @@
     </w:p>
     <w:p>
       <w:pPr>
-        <w:spacing w:after="180" w:line="360"/>
+        <w:spacing w:after="120" w:line="312"/>
         <w:jc w:val="left"/>
       </w:pPr>
       <w:r>
@@ -3786,7 +3786,7 @@
     </w:p>
     <w:p>
       <w:pPr>
-        <w:spacing w:after="180" w:line="360"/>
+        <w:spacing w:after="120" w:line="312"/>
         <w:jc w:val="left"/>
       </w:pPr>
       <w:r>
@@ -3800,7 +3800,7 @@
     </w:p>
     <w:p>
       <w:pPr>
-        <w:spacing w:after="180" w:line="360"/>
+        <w:spacing w:after="120" w:line="312"/>
         <w:jc w:val="left"/>
       </w:pPr>
       <w:r>
@@ -3814,7 +3814,7 @@
     </w:p>
     <w:p>
       <w:pPr>
-        <w:spacing w:after="180" w:line="360"/>
+        <w:spacing w:after="120" w:line="312"/>
         <w:jc w:val="left"/>
       </w:pPr>
       <w:r>
@@ -3828,7 +3828,7 @@
     </w:p>
     <w:p>
       <w:pPr>
-        <w:spacing w:after="180" w:line="360"/>
+        <w:spacing w:after="120" w:line="312"/>
         <w:jc w:val="left"/>
       </w:pPr>
       <w:r>
@@ -3842,7 +3842,7 @@
     </w:p>
     <w:p>
       <w:pPr>
-        <w:spacing w:after="180" w:line="360"/>
+        <w:spacing w:after="120" w:line="312"/>
         <w:jc w:val="left"/>
       </w:pPr>
       <w:r>
@@ -3856,7 +3856,7 @@
     </w:p>
     <w:p>
       <w:pPr>
-        <w:spacing w:after="180" w:line="360"/>
+        <w:spacing w:after="120" w:line="312"/>
         <w:jc w:val="left"/>
       </w:pPr>
       <w:r>
@@ -3870,7 +3870,7 @@
     </w:p>
     <w:p>
       <w:pPr>
-        <w:spacing w:after="180" w:line="360"/>
+        <w:spacing w:after="120" w:line="312"/>
         <w:jc w:val="left"/>
       </w:pPr>
       <w:r>
@@ -3884,7 +3884,7 @@
     </w:p>
     <w:p>
       <w:pPr>
-        <w:spacing w:after="180" w:line="360"/>
+        <w:spacing w:after="120" w:line="312"/>
         <w:jc w:val="left"/>
       </w:pPr>
       <w:r>
@@ -3898,7 +3898,7 @@
     </w:p>
     <w:p>
       <w:pPr>
-        <w:spacing w:after="180" w:line="360"/>
+        <w:spacing w:after="120" w:line="312"/>
         <w:jc w:val="left"/>
       </w:pPr>
       <w:r>
@@ -3912,7 +3912,7 @@
     </w:p>
     <w:p>
       <w:pPr>
-        <w:spacing w:after="180" w:line="360"/>
+        <w:spacing w:after="120" w:line="312"/>
         <w:jc w:val="left"/>
       </w:pPr>
       <w:r>
@@ -3926,7 +3926,7 @@
     </w:p>
     <w:p>
       <w:pPr>
-        <w:spacing w:after="180" w:line="360"/>
+        <w:spacing w:after="120" w:line="312"/>
         <w:jc w:val="left"/>
       </w:pPr>
       <w:r>

</xml_diff>